<commit_message>
Enhance international cooperation and congratulatory messages
- Added a section on ARQUS activities and initiatives in international cooperation.
- Updated partnerships with foreign universities, emphasizing sustainability and student engagement.
- Included visits by foreign university representatives and their contributions to VU SR.
- Expanded congratulatory messages from university officials, including new sections for various leaders.
- Improved structure and formatting of congratulatory messages for clarity and engagement.
- Added new images for congratulatory messages to enhance visual appeal.
</commit_message>
<xml_diff>
--- a/06. Ataskaitos knygutė 2026/[4] Kokybiškos studijos ir joms pritaikyta aplinka/[4.1] Nacionalinis ir miesto savivaldoje atstovavimas.docx
+++ b/06. Ataskaitos knygutė 2026/[4] Kokybiškos studijos ir joms pritaikyta aplinka/[4.1] Nacionalinis ir miesto savivaldoje atstovavimas.docx
@@ -18108,26 +18108,26 @@
           <w:sz w:val="24"/>
           <w:szCs w:val="24"/>
           <w:u w:val="none"/>
-          <w:lang w:val="en-US"/>
-        </w:rPr>
-      </w:pPr>
-      <w:r>
-        <w:rPr>
-          <w:rFonts w:ascii="Aptos" w:hAnsi="Aptos" w:eastAsia="Aptos" w:cs="Aptos" w:asciiTheme="minorAscii" w:hAnsiTheme="minorAscii" w:eastAsiaTheme="minorAscii" w:cstheme="minorAscii"/>
-          <w:b w:val="0"/>
-          <w:bCs w:val="0"/>
-          <w:i w:val="0"/>
-          <w:iCs w:val="0"/>
-          <w:caps w:val="0"/>
-          <w:smallCaps w:val="0"/>
-          <w:strike w:val="0"/>
-          <w:dstrike w:val="0"/>
-          <w:noProof w:val="0"/>
-          <w:color w:val="212121"/>
-          <w:sz w:val="24"/>
-          <w:szCs w:val="24"/>
-          <w:u w:val="none"/>
-          <w:lang w:val="en-US"/>
+          <w:lang w:val="en-GB"/>
+        </w:rPr>
+      </w:pPr>
+      <w:r>
+        <w:rPr>
+          <w:rFonts w:ascii="Aptos" w:hAnsi="Aptos" w:eastAsia="Aptos" w:cs="Aptos" w:asciiTheme="minorAscii" w:hAnsiTheme="minorAscii" w:eastAsiaTheme="minorAscii" w:cstheme="minorAscii"/>
+          <w:b w:val="0"/>
+          <w:bCs w:val="0"/>
+          <w:i w:val="0"/>
+          <w:iCs w:val="0"/>
+          <w:caps w:val="0"/>
+          <w:smallCaps w:val="0"/>
+          <w:strike w:val="0"/>
+          <w:dstrike w:val="0"/>
+          <w:noProof w:val="0"/>
+          <w:color w:val="212121"/>
+          <w:sz w:val="24"/>
+          <w:szCs w:val="24"/>
+          <w:u w:val="none"/>
+          <w:lang w:val="en-GB"/>
         </w:rPr>
         <w:t xml:space="preserve">We also met with Liutauras Kazlavickas, a member of the Seimas Committee on Education and </w:t>
       </w:r>
@@ -18147,7 +18147,7 @@
           <w:sz w:val="24"/>
           <w:szCs w:val="24"/>
           <w:u w:val="none"/>
-          <w:lang w:val="en-US"/>
+          <w:lang w:val="en-GB"/>
         </w:rPr>
         <w:t>Science,</w:t>
       </w:r>
@@ -18167,7 +18167,7 @@
           <w:sz w:val="24"/>
           <w:szCs w:val="24"/>
           <w:u w:val="none"/>
-          <w:lang w:val="en-US"/>
+          <w:lang w:val="en-GB"/>
         </w:rPr>
         <w:t xml:space="preserve"> and the committee’s vice-chair. During the meeting, we discussed changes to the Law on the Legal Status of Foreigners, the challenges of integrating international students, and the necessary solutions</w:t>
       </w:r>
@@ -18187,7 +18187,7 @@
           <w:sz w:val="24"/>
           <w:szCs w:val="24"/>
           <w:u w:val="none"/>
-          <w:lang w:val="en-US"/>
+          <w:lang w:val="en-GB"/>
         </w:rPr>
         <w:t xml:space="preserve">.  </w:t>
       </w:r>
@@ -18235,7 +18235,47 @@
           <w:u w:val="none"/>
           <w:lang w:val="en-US"/>
         </w:rPr>
-        <w:t xml:space="preserve">We organized a protest at the Seimas against the proposed amendments to the Law on Medical Practice </w:t>
+        <w:t>We organized a protest at</w:t>
+      </w:r>
+      <w:r>
+        <w:rPr>
+          <w:rFonts w:ascii="Aptos" w:hAnsi="Aptos" w:eastAsia="Aptos" w:cs="Aptos" w:asciiTheme="minorAscii" w:hAnsiTheme="minorAscii" w:eastAsiaTheme="minorAscii" w:cstheme="minorAscii"/>
+          <w:b w:val="0"/>
+          <w:bCs w:val="0"/>
+          <w:i w:val="0"/>
+          <w:iCs w:val="0"/>
+          <w:caps w:val="0"/>
+          <w:smallCaps w:val="0"/>
+          <w:strike w:val="0"/>
+          <w:dstrike w:val="0"/>
+          <w:noProof w:val="0"/>
+          <w:color w:val="212121"/>
+          <w:sz w:val="24"/>
+          <w:szCs w:val="24"/>
+          <w:u w:val="none"/>
+          <w:lang w:val="en-US"/>
+        </w:rPr>
+        <w:t xml:space="preserve"> </w:t>
+      </w:r>
+      <w:r>
+        <w:rPr>
+          <w:rFonts w:ascii="Aptos" w:hAnsi="Aptos" w:eastAsia="Aptos" w:cs="Aptos" w:asciiTheme="minorAscii" w:hAnsiTheme="minorAscii" w:eastAsiaTheme="minorAscii" w:cstheme="minorAscii"/>
+          <w:b w:val="0"/>
+          <w:bCs w:val="0"/>
+          <w:i w:val="0"/>
+          <w:iCs w:val="0"/>
+          <w:caps w:val="0"/>
+          <w:smallCaps w:val="0"/>
+          <w:strike w:val="0"/>
+          <w:dstrike w:val="0"/>
+          <w:noProof w:val="0"/>
+          <w:color w:val="212121"/>
+          <w:sz w:val="24"/>
+          <w:szCs w:val="24"/>
+          <w:u w:val="none"/>
+          <w:lang w:val="en-US"/>
+        </w:rPr>
+        <w:t xml:space="preserve">Seimas against the proposed amendments to the Law on Medical Practice </w:t>
       </w:r>
       <w:r>
         <w:rPr>
@@ -18300,26 +18340,26 @@
           <w:sz w:val="24"/>
           <w:szCs w:val="24"/>
           <w:u w:val="none"/>
-          <w:lang w:val="en-US"/>
-        </w:rPr>
-      </w:pPr>
-      <w:r>
-        <w:rPr>
-          <w:rFonts w:ascii="Aptos" w:hAnsi="Aptos" w:eastAsia="Aptos" w:cs="Aptos" w:asciiTheme="minorAscii" w:hAnsiTheme="minorAscii" w:eastAsiaTheme="minorAscii" w:cstheme="minorAscii"/>
-          <w:b w:val="0"/>
-          <w:bCs w:val="0"/>
-          <w:i w:val="0"/>
-          <w:iCs w:val="0"/>
-          <w:caps w:val="0"/>
-          <w:smallCaps w:val="0"/>
-          <w:strike w:val="0"/>
-          <w:dstrike w:val="0"/>
-          <w:noProof w:val="0"/>
-          <w:color w:val="212121"/>
-          <w:sz w:val="24"/>
-          <w:szCs w:val="24"/>
-          <w:u w:val="none"/>
-          <w:lang w:val="en-US"/>
+          <w:lang w:val="en-GB"/>
+        </w:rPr>
+      </w:pPr>
+      <w:r>
+        <w:rPr>
+          <w:rFonts w:ascii="Aptos" w:hAnsi="Aptos" w:eastAsia="Aptos" w:cs="Aptos" w:asciiTheme="minorAscii" w:hAnsiTheme="minorAscii" w:eastAsiaTheme="minorAscii" w:cstheme="minorAscii"/>
+          <w:b w:val="0"/>
+          <w:bCs w:val="0"/>
+          <w:i w:val="0"/>
+          <w:iCs w:val="0"/>
+          <w:caps w:val="0"/>
+          <w:smallCaps w:val="0"/>
+          <w:strike w:val="0"/>
+          <w:dstrike w:val="0"/>
+          <w:noProof w:val="0"/>
+          <w:color w:val="212121"/>
+          <w:sz w:val="24"/>
+          <w:szCs w:val="24"/>
+          <w:u w:val="none"/>
+          <w:lang w:val="en-GB"/>
         </w:rPr>
         <w:t>During</w:t>
       </w:r>
@@ -18339,27 +18379,27 @@
           <w:sz w:val="24"/>
           <w:szCs w:val="24"/>
           <w:u w:val="none"/>
-          <w:lang w:val="en-US"/>
-        </w:rPr>
-        <w:t xml:space="preserve"> </w:t>
-      </w:r>
-      <w:r>
-        <w:rPr>
-          <w:rFonts w:ascii="Aptos" w:hAnsi="Aptos" w:eastAsia="Aptos" w:cs="Aptos" w:asciiTheme="minorAscii" w:hAnsiTheme="minorAscii" w:eastAsiaTheme="minorAscii" w:cstheme="minorAscii"/>
-          <w:b w:val="0"/>
-          <w:bCs w:val="0"/>
-          <w:i w:val="0"/>
-          <w:iCs w:val="0"/>
-          <w:caps w:val="0"/>
-          <w:smallCaps w:val="0"/>
-          <w:strike w:val="0"/>
-          <w:dstrike w:val="0"/>
-          <w:noProof w:val="0"/>
-          <w:color w:val="212121"/>
-          <w:sz w:val="24"/>
-          <w:szCs w:val="24"/>
-          <w:u w:val="none"/>
-          <w:lang w:val="en-US"/>
+          <w:lang w:val="en-GB"/>
+        </w:rPr>
+        <w:t xml:space="preserve"> </w:t>
+      </w:r>
+      <w:r>
+        <w:rPr>
+          <w:rFonts w:ascii="Aptos" w:hAnsi="Aptos" w:eastAsia="Aptos" w:cs="Aptos" w:asciiTheme="minorAscii" w:hAnsiTheme="minorAscii" w:eastAsiaTheme="minorAscii" w:cstheme="minorAscii"/>
+          <w:b w:val="0"/>
+          <w:bCs w:val="0"/>
+          <w:i w:val="0"/>
+          <w:iCs w:val="0"/>
+          <w:caps w:val="0"/>
+          <w:smallCaps w:val="0"/>
+          <w:strike w:val="0"/>
+          <w:dstrike w:val="0"/>
+          <w:noProof w:val="0"/>
+          <w:color w:val="212121"/>
+          <w:sz w:val="24"/>
+          <w:szCs w:val="24"/>
+          <w:u w:val="none"/>
+          <w:lang w:val="en-GB"/>
         </w:rPr>
         <w:t>the</w:t>
       </w:r>
@@ -18379,27 +18419,27 @@
           <w:sz w:val="24"/>
           <w:szCs w:val="24"/>
           <w:u w:val="none"/>
-          <w:lang w:val="en-US"/>
-        </w:rPr>
-        <w:t xml:space="preserve"> </w:t>
-      </w:r>
-      <w:r>
-        <w:rPr>
-          <w:rFonts w:ascii="Aptos" w:hAnsi="Aptos" w:eastAsia="Aptos" w:cs="Aptos" w:asciiTheme="minorAscii" w:hAnsiTheme="minorAscii" w:eastAsiaTheme="minorAscii" w:cstheme="minorAscii"/>
-          <w:b w:val="0"/>
-          <w:bCs w:val="0"/>
-          <w:i w:val="0"/>
-          <w:iCs w:val="0"/>
-          <w:caps w:val="0"/>
-          <w:smallCaps w:val="0"/>
-          <w:strike w:val="0"/>
-          <w:dstrike w:val="0"/>
-          <w:noProof w:val="0"/>
-          <w:color w:val="212121"/>
-          <w:sz w:val="24"/>
-          <w:szCs w:val="24"/>
-          <w:u w:val="none"/>
-          <w:lang w:val="en-US"/>
+          <w:lang w:val="en-GB"/>
+        </w:rPr>
+        <w:t xml:space="preserve"> </w:t>
+      </w:r>
+      <w:r>
+        <w:rPr>
+          <w:rFonts w:ascii="Aptos" w:hAnsi="Aptos" w:eastAsia="Aptos" w:cs="Aptos" w:asciiTheme="minorAscii" w:hAnsiTheme="minorAscii" w:eastAsiaTheme="minorAscii" w:cstheme="minorAscii"/>
+          <w:b w:val="0"/>
+          <w:bCs w:val="0"/>
+          <w:i w:val="0"/>
+          <w:iCs w:val="0"/>
+          <w:caps w:val="0"/>
+          <w:smallCaps w:val="0"/>
+          <w:strike w:val="0"/>
+          <w:dstrike w:val="0"/>
+          <w:noProof w:val="0"/>
+          <w:color w:val="212121"/>
+          <w:sz w:val="24"/>
+          <w:szCs w:val="24"/>
+          <w:u w:val="none"/>
+          <w:lang w:val="en-GB"/>
         </w:rPr>
         <w:t>reporting</w:t>
       </w:r>
@@ -18419,27 +18459,27 @@
           <w:sz w:val="24"/>
           <w:szCs w:val="24"/>
           <w:u w:val="none"/>
-          <w:lang w:val="en-US"/>
-        </w:rPr>
-        <w:t xml:space="preserve"> </w:t>
-      </w:r>
-      <w:r>
-        <w:rPr>
-          <w:rFonts w:ascii="Aptos" w:hAnsi="Aptos" w:eastAsia="Aptos" w:cs="Aptos" w:asciiTheme="minorAscii" w:hAnsiTheme="minorAscii" w:eastAsiaTheme="minorAscii" w:cstheme="minorAscii"/>
-          <w:b w:val="0"/>
-          <w:bCs w:val="0"/>
-          <w:i w:val="0"/>
-          <w:iCs w:val="0"/>
-          <w:caps w:val="0"/>
-          <w:smallCaps w:val="0"/>
-          <w:strike w:val="0"/>
-          <w:dstrike w:val="0"/>
-          <w:noProof w:val="0"/>
-          <w:color w:val="212121"/>
-          <w:sz w:val="24"/>
-          <w:szCs w:val="24"/>
-          <w:u w:val="none"/>
-          <w:lang w:val="en-US"/>
+          <w:lang w:val="en-GB"/>
+        </w:rPr>
+        <w:t xml:space="preserve"> </w:t>
+      </w:r>
+      <w:r>
+        <w:rPr>
+          <w:rFonts w:ascii="Aptos" w:hAnsi="Aptos" w:eastAsia="Aptos" w:cs="Aptos" w:asciiTheme="minorAscii" w:hAnsiTheme="minorAscii" w:eastAsiaTheme="minorAscii" w:cstheme="minorAscii"/>
+          <w:b w:val="0"/>
+          <w:bCs w:val="0"/>
+          <w:i w:val="0"/>
+          <w:iCs w:val="0"/>
+          <w:caps w:val="0"/>
+          <w:smallCaps w:val="0"/>
+          <w:strike w:val="0"/>
+          <w:dstrike w:val="0"/>
+          <w:noProof w:val="0"/>
+          <w:color w:val="212121"/>
+          <w:sz w:val="24"/>
+          <w:szCs w:val="24"/>
+          <w:u w:val="none"/>
+          <w:lang w:val="en-GB"/>
         </w:rPr>
         <w:t>period</w:t>
       </w:r>
@@ -18459,7 +18499,7 @@
           <w:sz w:val="24"/>
           <w:szCs w:val="24"/>
           <w:u w:val="none"/>
-          <w:lang w:val="en-US"/>
+          <w:lang w:val="en-GB"/>
         </w:rPr>
         <w:t xml:space="preserve">, </w:t>
       </w:r>
@@ -18479,7 +18519,7 @@
           <w:sz w:val="24"/>
           <w:szCs w:val="24"/>
           <w:u w:val="none"/>
-          <w:lang w:val="en-US"/>
+          <w:lang w:val="en-GB"/>
         </w:rPr>
         <w:t>we</w:t>
       </w:r>
@@ -18499,27 +18539,27 @@
           <w:sz w:val="24"/>
           <w:szCs w:val="24"/>
           <w:u w:val="none"/>
-          <w:lang w:val="en-US"/>
-        </w:rPr>
-        <w:t xml:space="preserve"> </w:t>
-      </w:r>
-      <w:r>
-        <w:rPr>
-          <w:rFonts w:ascii="Aptos" w:hAnsi="Aptos" w:eastAsia="Aptos" w:cs="Aptos" w:asciiTheme="minorAscii" w:hAnsiTheme="minorAscii" w:eastAsiaTheme="minorAscii" w:cstheme="minorAscii"/>
-          <w:b w:val="0"/>
-          <w:bCs w:val="0"/>
-          <w:i w:val="0"/>
-          <w:iCs w:val="0"/>
-          <w:caps w:val="0"/>
-          <w:smallCaps w:val="0"/>
-          <w:strike w:val="0"/>
-          <w:dstrike w:val="0"/>
-          <w:noProof w:val="0"/>
-          <w:color w:val="212121"/>
-          <w:sz w:val="24"/>
-          <w:szCs w:val="24"/>
-          <w:u w:val="none"/>
-          <w:lang w:val="en-US"/>
+          <w:lang w:val="en-GB"/>
+        </w:rPr>
+        <w:t xml:space="preserve"> </w:t>
+      </w:r>
+      <w:r>
+        <w:rPr>
+          <w:rFonts w:ascii="Aptos" w:hAnsi="Aptos" w:eastAsia="Aptos" w:cs="Aptos" w:asciiTheme="minorAscii" w:hAnsiTheme="minorAscii" w:eastAsiaTheme="minorAscii" w:cstheme="minorAscii"/>
+          <w:b w:val="0"/>
+          <w:bCs w:val="0"/>
+          <w:i w:val="0"/>
+          <w:iCs w:val="0"/>
+          <w:caps w:val="0"/>
+          <w:smallCaps w:val="0"/>
+          <w:strike w:val="0"/>
+          <w:dstrike w:val="0"/>
+          <w:noProof w:val="0"/>
+          <w:color w:val="212121"/>
+          <w:sz w:val="24"/>
+          <w:szCs w:val="24"/>
+          <w:u w:val="none"/>
+          <w:lang w:val="en-GB"/>
         </w:rPr>
         <w:t>participated</w:t>
       </w:r>
@@ -18539,27 +18579,27 @@
           <w:sz w:val="24"/>
           <w:szCs w:val="24"/>
           <w:u w:val="none"/>
-          <w:lang w:val="en-US"/>
-        </w:rPr>
-        <w:t xml:space="preserve"> </w:t>
-      </w:r>
-      <w:r>
-        <w:rPr>
-          <w:rFonts w:ascii="Aptos" w:hAnsi="Aptos" w:eastAsia="Aptos" w:cs="Aptos" w:asciiTheme="minorAscii" w:hAnsiTheme="minorAscii" w:eastAsiaTheme="minorAscii" w:cstheme="minorAscii"/>
-          <w:b w:val="0"/>
-          <w:bCs w:val="0"/>
-          <w:i w:val="0"/>
-          <w:iCs w:val="0"/>
-          <w:caps w:val="0"/>
-          <w:smallCaps w:val="0"/>
-          <w:strike w:val="0"/>
-          <w:dstrike w:val="0"/>
-          <w:noProof w:val="0"/>
-          <w:color w:val="212121"/>
-          <w:sz w:val="24"/>
-          <w:szCs w:val="24"/>
-          <w:u w:val="none"/>
-          <w:lang w:val="en-US"/>
+          <w:lang w:val="en-GB"/>
+        </w:rPr>
+        <w:t xml:space="preserve"> </w:t>
+      </w:r>
+      <w:r>
+        <w:rPr>
+          <w:rFonts w:ascii="Aptos" w:hAnsi="Aptos" w:eastAsia="Aptos" w:cs="Aptos" w:asciiTheme="minorAscii" w:hAnsiTheme="minorAscii" w:eastAsiaTheme="minorAscii" w:cstheme="minorAscii"/>
+          <w:b w:val="0"/>
+          <w:bCs w:val="0"/>
+          <w:i w:val="0"/>
+          <w:iCs w:val="0"/>
+          <w:caps w:val="0"/>
+          <w:smallCaps w:val="0"/>
+          <w:strike w:val="0"/>
+          <w:dstrike w:val="0"/>
+          <w:noProof w:val="0"/>
+          <w:color w:val="212121"/>
+          <w:sz w:val="24"/>
+          <w:szCs w:val="24"/>
+          <w:u w:val="none"/>
+          <w:lang w:val="en-GB"/>
         </w:rPr>
         <w:t>in</w:t>
       </w:r>
@@ -18579,27 +18619,27 @@
           <w:sz w:val="24"/>
           <w:szCs w:val="24"/>
           <w:u w:val="none"/>
-          <w:lang w:val="en-US"/>
-        </w:rPr>
-        <w:t xml:space="preserve"> </w:t>
-      </w:r>
-      <w:r>
-        <w:rPr>
-          <w:rFonts w:ascii="Aptos" w:hAnsi="Aptos" w:eastAsia="Aptos" w:cs="Aptos" w:asciiTheme="minorAscii" w:hAnsiTheme="minorAscii" w:eastAsiaTheme="minorAscii" w:cstheme="minorAscii"/>
-          <w:b w:val="0"/>
-          <w:bCs w:val="0"/>
-          <w:i w:val="0"/>
-          <w:iCs w:val="0"/>
-          <w:caps w:val="0"/>
-          <w:smallCaps w:val="0"/>
-          <w:strike w:val="0"/>
-          <w:dstrike w:val="0"/>
-          <w:noProof w:val="0"/>
-          <w:color w:val="212121"/>
-          <w:sz w:val="24"/>
-          <w:szCs w:val="24"/>
-          <w:u w:val="none"/>
-          <w:lang w:val="en-US"/>
+          <w:lang w:val="en-GB"/>
+        </w:rPr>
+        <w:t xml:space="preserve"> </w:t>
+      </w:r>
+      <w:r>
+        <w:rPr>
+          <w:rFonts w:ascii="Aptos" w:hAnsi="Aptos" w:eastAsia="Aptos" w:cs="Aptos" w:asciiTheme="minorAscii" w:hAnsiTheme="minorAscii" w:eastAsiaTheme="minorAscii" w:cstheme="minorAscii"/>
+          <w:b w:val="0"/>
+          <w:bCs w:val="0"/>
+          <w:i w:val="0"/>
+          <w:iCs w:val="0"/>
+          <w:caps w:val="0"/>
+          <w:smallCaps w:val="0"/>
+          <w:strike w:val="0"/>
+          <w:dstrike w:val="0"/>
+          <w:noProof w:val="0"/>
+          <w:color w:val="212121"/>
+          <w:sz w:val="24"/>
+          <w:szCs w:val="24"/>
+          <w:u w:val="none"/>
+          <w:lang w:val="en-GB"/>
         </w:rPr>
         <w:t>meetings</w:t>
       </w:r>
@@ -18619,27 +18659,27 @@
           <w:sz w:val="24"/>
           <w:szCs w:val="24"/>
           <w:u w:val="none"/>
-          <w:lang w:val="en-US"/>
-        </w:rPr>
-        <w:t xml:space="preserve"> </w:t>
-      </w:r>
-      <w:r>
-        <w:rPr>
-          <w:rFonts w:ascii="Aptos" w:hAnsi="Aptos" w:eastAsia="Aptos" w:cs="Aptos" w:asciiTheme="minorAscii" w:hAnsiTheme="minorAscii" w:eastAsiaTheme="minorAscii" w:cstheme="minorAscii"/>
-          <w:b w:val="0"/>
-          <w:bCs w:val="0"/>
-          <w:i w:val="0"/>
-          <w:iCs w:val="0"/>
-          <w:caps w:val="0"/>
-          <w:smallCaps w:val="0"/>
-          <w:strike w:val="0"/>
-          <w:dstrike w:val="0"/>
-          <w:noProof w:val="0"/>
-          <w:color w:val="212121"/>
-          <w:sz w:val="24"/>
-          <w:szCs w:val="24"/>
-          <w:u w:val="none"/>
-          <w:lang w:val="en-US"/>
+          <w:lang w:val="en-GB"/>
+        </w:rPr>
+        <w:t xml:space="preserve"> </w:t>
+      </w:r>
+      <w:r>
+        <w:rPr>
+          <w:rFonts w:ascii="Aptos" w:hAnsi="Aptos" w:eastAsia="Aptos" w:cs="Aptos" w:asciiTheme="minorAscii" w:hAnsiTheme="minorAscii" w:eastAsiaTheme="minorAscii" w:cstheme="minorAscii"/>
+          <w:b w:val="0"/>
+          <w:bCs w:val="0"/>
+          <w:i w:val="0"/>
+          <w:iCs w:val="0"/>
+          <w:caps w:val="0"/>
+          <w:smallCaps w:val="0"/>
+          <w:strike w:val="0"/>
+          <w:dstrike w:val="0"/>
+          <w:noProof w:val="0"/>
+          <w:color w:val="212121"/>
+          <w:sz w:val="24"/>
+          <w:szCs w:val="24"/>
+          <w:u w:val="none"/>
+          <w:lang w:val="en-GB"/>
         </w:rPr>
         <w:t>of</w:t>
       </w:r>
@@ -18659,27 +18699,27 @@
           <w:sz w:val="24"/>
           <w:szCs w:val="24"/>
           <w:u w:val="none"/>
-          <w:lang w:val="en-US"/>
-        </w:rPr>
-        <w:t xml:space="preserve"> </w:t>
-      </w:r>
-      <w:r>
-        <w:rPr>
-          <w:rFonts w:ascii="Aptos" w:hAnsi="Aptos" w:eastAsia="Aptos" w:cs="Aptos" w:asciiTheme="minorAscii" w:hAnsiTheme="minorAscii" w:eastAsiaTheme="minorAscii" w:cstheme="minorAscii"/>
-          <w:b w:val="0"/>
-          <w:bCs w:val="0"/>
-          <w:i w:val="0"/>
-          <w:iCs w:val="0"/>
-          <w:caps w:val="0"/>
-          <w:smallCaps w:val="0"/>
-          <w:strike w:val="0"/>
-          <w:dstrike w:val="0"/>
-          <w:noProof w:val="0"/>
-          <w:color w:val="212121"/>
-          <w:sz w:val="24"/>
-          <w:szCs w:val="24"/>
-          <w:u w:val="none"/>
-          <w:lang w:val="en-US"/>
+          <w:lang w:val="en-GB"/>
+        </w:rPr>
+        <w:t xml:space="preserve"> </w:t>
+      </w:r>
+      <w:r>
+        <w:rPr>
+          <w:rFonts w:ascii="Aptos" w:hAnsi="Aptos" w:eastAsia="Aptos" w:cs="Aptos" w:asciiTheme="minorAscii" w:hAnsiTheme="minorAscii" w:eastAsiaTheme="minorAscii" w:cstheme="minorAscii"/>
+          <w:b w:val="0"/>
+          <w:bCs w:val="0"/>
+          <w:i w:val="0"/>
+          <w:iCs w:val="0"/>
+          <w:caps w:val="0"/>
+          <w:smallCaps w:val="0"/>
+          <w:strike w:val="0"/>
+          <w:dstrike w:val="0"/>
+          <w:noProof w:val="0"/>
+          <w:color w:val="212121"/>
+          <w:sz w:val="24"/>
+          <w:szCs w:val="24"/>
+          <w:u w:val="none"/>
+          <w:lang w:val="en-GB"/>
         </w:rPr>
         <w:t>the</w:t>
       </w:r>
@@ -18699,7 +18739,7 @@
           <w:sz w:val="24"/>
           <w:szCs w:val="24"/>
           <w:u w:val="none"/>
-          <w:lang w:val="en-US"/>
+          <w:lang w:val="en-GB"/>
         </w:rPr>
         <w:t xml:space="preserve"> Seimas </w:t>
       </w:r>
@@ -18719,7 +18759,7 @@
           <w:sz w:val="24"/>
           <w:szCs w:val="24"/>
           <w:u w:val="none"/>
-          <w:lang w:val="en-US"/>
+          <w:lang w:val="en-GB"/>
         </w:rPr>
         <w:t>Committee</w:t>
       </w:r>
@@ -18739,27 +18779,27 @@
           <w:sz w:val="24"/>
           <w:szCs w:val="24"/>
           <w:u w:val="none"/>
-          <w:lang w:val="en-US"/>
-        </w:rPr>
-        <w:t xml:space="preserve"> </w:t>
-      </w:r>
-      <w:r>
-        <w:rPr>
-          <w:rFonts w:ascii="Aptos" w:hAnsi="Aptos" w:eastAsia="Aptos" w:cs="Aptos" w:asciiTheme="minorAscii" w:hAnsiTheme="minorAscii" w:eastAsiaTheme="minorAscii" w:cstheme="minorAscii"/>
-          <w:b w:val="0"/>
-          <w:bCs w:val="0"/>
-          <w:i w:val="0"/>
-          <w:iCs w:val="0"/>
-          <w:caps w:val="0"/>
-          <w:smallCaps w:val="0"/>
-          <w:strike w:val="0"/>
-          <w:dstrike w:val="0"/>
-          <w:noProof w:val="0"/>
-          <w:color w:val="212121"/>
-          <w:sz w:val="24"/>
-          <w:szCs w:val="24"/>
-          <w:u w:val="none"/>
-          <w:lang w:val="en-US"/>
+          <w:lang w:val="en-GB"/>
+        </w:rPr>
+        <w:t xml:space="preserve"> </w:t>
+      </w:r>
+      <w:r>
+        <w:rPr>
+          <w:rFonts w:ascii="Aptos" w:hAnsi="Aptos" w:eastAsia="Aptos" w:cs="Aptos" w:asciiTheme="minorAscii" w:hAnsiTheme="minorAscii" w:eastAsiaTheme="minorAscii" w:cstheme="minorAscii"/>
+          <w:b w:val="0"/>
+          <w:bCs w:val="0"/>
+          <w:i w:val="0"/>
+          <w:iCs w:val="0"/>
+          <w:caps w:val="0"/>
+          <w:smallCaps w:val="0"/>
+          <w:strike w:val="0"/>
+          <w:dstrike w:val="0"/>
+          <w:noProof w:val="0"/>
+          <w:color w:val="212121"/>
+          <w:sz w:val="24"/>
+          <w:szCs w:val="24"/>
+          <w:u w:val="none"/>
+          <w:lang w:val="en-GB"/>
         </w:rPr>
         <w:t>on</w:t>
       </w:r>
@@ -18779,27 +18819,27 @@
           <w:sz w:val="24"/>
           <w:szCs w:val="24"/>
           <w:u w:val="none"/>
-          <w:lang w:val="en-US"/>
-        </w:rPr>
-        <w:t xml:space="preserve"> </w:t>
-      </w:r>
-      <w:r>
-        <w:rPr>
-          <w:rFonts w:ascii="Aptos" w:hAnsi="Aptos" w:eastAsia="Aptos" w:cs="Aptos" w:asciiTheme="minorAscii" w:hAnsiTheme="minorAscii" w:eastAsiaTheme="minorAscii" w:cstheme="minorAscii"/>
-          <w:b w:val="0"/>
-          <w:bCs w:val="0"/>
-          <w:i w:val="0"/>
-          <w:iCs w:val="0"/>
-          <w:caps w:val="0"/>
-          <w:smallCaps w:val="0"/>
-          <w:strike w:val="0"/>
-          <w:dstrike w:val="0"/>
-          <w:noProof w:val="0"/>
-          <w:color w:val="212121"/>
-          <w:sz w:val="24"/>
-          <w:szCs w:val="24"/>
-          <w:u w:val="none"/>
-          <w:lang w:val="en-US"/>
+          <w:lang w:val="en-GB"/>
+        </w:rPr>
+        <w:t xml:space="preserve"> </w:t>
+      </w:r>
+      <w:r>
+        <w:rPr>
+          <w:rFonts w:ascii="Aptos" w:hAnsi="Aptos" w:eastAsia="Aptos" w:cs="Aptos" w:asciiTheme="minorAscii" w:hAnsiTheme="minorAscii" w:eastAsiaTheme="minorAscii" w:cstheme="minorAscii"/>
+          <w:b w:val="0"/>
+          <w:bCs w:val="0"/>
+          <w:i w:val="0"/>
+          <w:iCs w:val="0"/>
+          <w:caps w:val="0"/>
+          <w:smallCaps w:val="0"/>
+          <w:strike w:val="0"/>
+          <w:dstrike w:val="0"/>
+          <w:noProof w:val="0"/>
+          <w:color w:val="212121"/>
+          <w:sz w:val="24"/>
+          <w:szCs w:val="24"/>
+          <w:u w:val="none"/>
+          <w:lang w:val="en-GB"/>
         </w:rPr>
         <w:t>Education</w:t>
       </w:r>
@@ -18819,27 +18859,27 @@
           <w:sz w:val="24"/>
           <w:szCs w:val="24"/>
           <w:u w:val="none"/>
-          <w:lang w:val="en-US"/>
-        </w:rPr>
-        <w:t xml:space="preserve"> </w:t>
-      </w:r>
-      <w:r>
-        <w:rPr>
-          <w:rFonts w:ascii="Aptos" w:hAnsi="Aptos" w:eastAsia="Aptos" w:cs="Aptos" w:asciiTheme="minorAscii" w:hAnsiTheme="minorAscii" w:eastAsiaTheme="minorAscii" w:cstheme="minorAscii"/>
-          <w:b w:val="0"/>
-          <w:bCs w:val="0"/>
-          <w:i w:val="0"/>
-          <w:iCs w:val="0"/>
-          <w:caps w:val="0"/>
-          <w:smallCaps w:val="0"/>
-          <w:strike w:val="0"/>
-          <w:dstrike w:val="0"/>
-          <w:noProof w:val="0"/>
-          <w:color w:val="212121"/>
-          <w:sz w:val="24"/>
-          <w:szCs w:val="24"/>
-          <w:u w:val="none"/>
-          <w:lang w:val="en-US"/>
+          <w:lang w:val="en-GB"/>
+        </w:rPr>
+        <w:t xml:space="preserve"> </w:t>
+      </w:r>
+      <w:r>
+        <w:rPr>
+          <w:rFonts w:ascii="Aptos" w:hAnsi="Aptos" w:eastAsia="Aptos" w:cs="Aptos" w:asciiTheme="minorAscii" w:hAnsiTheme="minorAscii" w:eastAsiaTheme="minorAscii" w:cstheme="minorAscii"/>
+          <w:b w:val="0"/>
+          <w:bCs w:val="0"/>
+          <w:i w:val="0"/>
+          <w:iCs w:val="0"/>
+          <w:caps w:val="0"/>
+          <w:smallCaps w:val="0"/>
+          <w:strike w:val="0"/>
+          <w:dstrike w:val="0"/>
+          <w:noProof w:val="0"/>
+          <w:color w:val="212121"/>
+          <w:sz w:val="24"/>
+          <w:szCs w:val="24"/>
+          <w:u w:val="none"/>
+          <w:lang w:val="en-GB"/>
         </w:rPr>
         <w:t>and</w:t>
       </w:r>
@@ -18859,27 +18899,27 @@
           <w:sz w:val="24"/>
           <w:szCs w:val="24"/>
           <w:u w:val="none"/>
-          <w:lang w:val="en-US"/>
-        </w:rPr>
-        <w:t xml:space="preserve"> </w:t>
-      </w:r>
-      <w:r>
-        <w:rPr>
-          <w:rFonts w:ascii="Aptos" w:hAnsi="Aptos" w:eastAsia="Aptos" w:cs="Aptos" w:asciiTheme="minorAscii" w:hAnsiTheme="minorAscii" w:eastAsiaTheme="minorAscii" w:cstheme="minorAscii"/>
-          <w:b w:val="0"/>
-          <w:bCs w:val="0"/>
-          <w:i w:val="0"/>
-          <w:iCs w:val="0"/>
-          <w:caps w:val="0"/>
-          <w:smallCaps w:val="0"/>
-          <w:strike w:val="0"/>
-          <w:dstrike w:val="0"/>
-          <w:noProof w:val="0"/>
-          <w:color w:val="212121"/>
-          <w:sz w:val="24"/>
-          <w:szCs w:val="24"/>
-          <w:u w:val="none"/>
-          <w:lang w:val="en-US"/>
+          <w:lang w:val="en-GB"/>
+        </w:rPr>
+        <w:t xml:space="preserve"> </w:t>
+      </w:r>
+      <w:r>
+        <w:rPr>
+          <w:rFonts w:ascii="Aptos" w:hAnsi="Aptos" w:eastAsia="Aptos" w:cs="Aptos" w:asciiTheme="minorAscii" w:hAnsiTheme="minorAscii" w:eastAsiaTheme="minorAscii" w:cstheme="minorAscii"/>
+          <w:b w:val="0"/>
+          <w:bCs w:val="0"/>
+          <w:i w:val="0"/>
+          <w:iCs w:val="0"/>
+          <w:caps w:val="0"/>
+          <w:smallCaps w:val="0"/>
+          <w:strike w:val="0"/>
+          <w:dstrike w:val="0"/>
+          <w:noProof w:val="0"/>
+          <w:color w:val="212121"/>
+          <w:sz w:val="24"/>
+          <w:szCs w:val="24"/>
+          <w:u w:val="none"/>
+          <w:lang w:val="en-GB"/>
         </w:rPr>
         <w:t>Science</w:t>
       </w:r>
@@ -18899,27 +18939,27 @@
           <w:sz w:val="24"/>
           <w:szCs w:val="24"/>
           <w:u w:val="none"/>
-          <w:lang w:val="en-US"/>
-        </w:rPr>
-        <w:t xml:space="preserve"> </w:t>
-      </w:r>
-      <w:r>
-        <w:rPr>
-          <w:rFonts w:ascii="Aptos" w:hAnsi="Aptos" w:eastAsia="Aptos" w:cs="Aptos" w:asciiTheme="minorAscii" w:hAnsiTheme="minorAscii" w:eastAsiaTheme="minorAscii" w:cstheme="minorAscii"/>
-          <w:b w:val="0"/>
-          <w:bCs w:val="0"/>
-          <w:i w:val="0"/>
-          <w:iCs w:val="0"/>
-          <w:caps w:val="0"/>
-          <w:smallCaps w:val="0"/>
-          <w:strike w:val="0"/>
-          <w:dstrike w:val="0"/>
-          <w:noProof w:val="0"/>
-          <w:color w:val="212121"/>
-          <w:sz w:val="24"/>
-          <w:szCs w:val="24"/>
-          <w:u w:val="none"/>
-          <w:lang w:val="en-US"/>
+          <w:lang w:val="en-GB"/>
+        </w:rPr>
+        <w:t xml:space="preserve"> </w:t>
+      </w:r>
+      <w:r>
+        <w:rPr>
+          <w:rFonts w:ascii="Aptos" w:hAnsi="Aptos" w:eastAsia="Aptos" w:cs="Aptos" w:asciiTheme="minorAscii" w:hAnsiTheme="minorAscii" w:eastAsiaTheme="minorAscii" w:cstheme="minorAscii"/>
+          <w:b w:val="0"/>
+          <w:bCs w:val="0"/>
+          <w:i w:val="0"/>
+          <w:iCs w:val="0"/>
+          <w:caps w:val="0"/>
+          <w:smallCaps w:val="0"/>
+          <w:strike w:val="0"/>
+          <w:dstrike w:val="0"/>
+          <w:noProof w:val="0"/>
+          <w:color w:val="212121"/>
+          <w:sz w:val="24"/>
+          <w:szCs w:val="24"/>
+          <w:u w:val="none"/>
+          <w:lang w:val="en-GB"/>
         </w:rPr>
         <w:t>as</w:t>
       </w:r>
@@ -18939,27 +18979,27 @@
           <w:sz w:val="24"/>
           <w:szCs w:val="24"/>
           <w:u w:val="none"/>
-          <w:lang w:val="en-US"/>
-        </w:rPr>
-        <w:t xml:space="preserve"> </w:t>
-      </w:r>
-      <w:r>
-        <w:rPr>
-          <w:rFonts w:ascii="Aptos" w:hAnsi="Aptos" w:eastAsia="Aptos" w:cs="Aptos" w:asciiTheme="minorAscii" w:hAnsiTheme="minorAscii" w:eastAsiaTheme="minorAscii" w:cstheme="minorAscii"/>
-          <w:b w:val="0"/>
-          <w:bCs w:val="0"/>
-          <w:i w:val="0"/>
-          <w:iCs w:val="0"/>
-          <w:caps w:val="0"/>
-          <w:smallCaps w:val="0"/>
-          <w:strike w:val="0"/>
-          <w:dstrike w:val="0"/>
-          <w:noProof w:val="0"/>
-          <w:color w:val="212121"/>
-          <w:sz w:val="24"/>
-          <w:szCs w:val="24"/>
-          <w:u w:val="none"/>
-          <w:lang w:val="en-US"/>
+          <w:lang w:val="en-GB"/>
+        </w:rPr>
+        <w:t xml:space="preserve"> </w:t>
+      </w:r>
+      <w:r>
+        <w:rPr>
+          <w:rFonts w:ascii="Aptos" w:hAnsi="Aptos" w:eastAsia="Aptos" w:cs="Aptos" w:asciiTheme="minorAscii" w:hAnsiTheme="minorAscii" w:eastAsiaTheme="minorAscii" w:cstheme="minorAscii"/>
+          <w:b w:val="0"/>
+          <w:bCs w:val="0"/>
+          <w:i w:val="0"/>
+          <w:iCs w:val="0"/>
+          <w:caps w:val="0"/>
+          <w:smallCaps w:val="0"/>
+          <w:strike w:val="0"/>
+          <w:dstrike w:val="0"/>
+          <w:noProof w:val="0"/>
+          <w:color w:val="212121"/>
+          <w:sz w:val="24"/>
+          <w:szCs w:val="24"/>
+          <w:u w:val="none"/>
+          <w:lang w:val="en-GB"/>
         </w:rPr>
         <w:t>guests</w:t>
       </w:r>
@@ -18979,7 +19019,7 @@
           <w:sz w:val="24"/>
           <w:szCs w:val="24"/>
           <w:u w:val="none"/>
-          <w:lang w:val="en-US"/>
+          <w:lang w:val="en-GB"/>
         </w:rPr>
         <w:t xml:space="preserve">.  </w:t>
       </w:r>
@@ -19058,26 +19098,26 @@
           <w:sz w:val="24"/>
           <w:szCs w:val="24"/>
           <w:u w:val="none"/>
-          <w:lang w:val="en-US"/>
-        </w:rPr>
-      </w:pPr>
-      <w:r>
-        <w:rPr>
-          <w:rFonts w:ascii="Aptos" w:hAnsi="Aptos" w:eastAsia="Aptos" w:cs="Aptos" w:asciiTheme="minorAscii" w:hAnsiTheme="minorAscii" w:eastAsiaTheme="minorAscii" w:cstheme="minorAscii"/>
-          <w:b w:val="0"/>
-          <w:bCs w:val="0"/>
-          <w:i w:val="0"/>
-          <w:iCs w:val="0"/>
-          <w:caps w:val="0"/>
-          <w:smallCaps w:val="0"/>
-          <w:strike w:val="0"/>
-          <w:dstrike w:val="0"/>
-          <w:noProof w:val="0"/>
-          <w:color w:val="212121"/>
-          <w:sz w:val="24"/>
-          <w:szCs w:val="24"/>
-          <w:u w:val="none"/>
-          <w:lang w:val="en-US"/>
+          <w:lang w:val="en-GB"/>
+        </w:rPr>
+      </w:pPr>
+      <w:r>
+        <w:rPr>
+          <w:rFonts w:ascii="Aptos" w:hAnsi="Aptos" w:eastAsia="Aptos" w:cs="Aptos" w:asciiTheme="minorAscii" w:hAnsiTheme="minorAscii" w:eastAsiaTheme="minorAscii" w:cstheme="minorAscii"/>
+          <w:b w:val="0"/>
+          <w:bCs w:val="0"/>
+          <w:i w:val="0"/>
+          <w:iCs w:val="0"/>
+          <w:caps w:val="0"/>
+          <w:smallCaps w:val="0"/>
+          <w:strike w:val="0"/>
+          <w:dstrike w:val="0"/>
+          <w:noProof w:val="0"/>
+          <w:color w:val="212121"/>
+          <w:sz w:val="24"/>
+          <w:szCs w:val="24"/>
+          <w:u w:val="none"/>
+          <w:lang w:val="en-GB"/>
         </w:rPr>
         <w:t xml:space="preserve">We </w:t>
       </w:r>
@@ -19097,7 +19137,7 @@
           <w:sz w:val="24"/>
           <w:szCs w:val="24"/>
           <w:u w:val="none"/>
-          <w:lang w:val="en-US"/>
+          <w:lang w:val="en-GB"/>
         </w:rPr>
         <w:t>participated</w:t>
       </w:r>
@@ -19117,7 +19157,7 @@
           <w:sz w:val="24"/>
           <w:szCs w:val="24"/>
           <w:u w:val="none"/>
-          <w:lang w:val="en-US"/>
+          <w:lang w:val="en-GB"/>
         </w:rPr>
         <w:t xml:space="preserve"> in a working group </w:t>
       </w:r>
@@ -19137,7 +19177,7 @@
           <w:sz w:val="24"/>
           <w:szCs w:val="24"/>
           <w:u w:val="none"/>
-          <w:lang w:val="en-US"/>
+          <w:lang w:val="en-GB"/>
         </w:rPr>
         <w:t>convened</w:t>
       </w:r>
@@ -19157,7 +19197,7 @@
           <w:sz w:val="24"/>
           <w:szCs w:val="24"/>
           <w:u w:val="none"/>
-          <w:lang w:val="en-US"/>
+          <w:lang w:val="en-GB"/>
         </w:rPr>
         <w:t xml:space="preserve"> by the Ministry of Education, Science and Sport of the Republic of Lithuania to develop a strategy for attracting and integrating international students. We </w:t>
       </w:r>
@@ -19177,7 +19217,7 @@
           <w:sz w:val="24"/>
           <w:szCs w:val="24"/>
           <w:u w:val="none"/>
-          <w:lang w:val="en-US"/>
+          <w:lang w:val="en-GB"/>
         </w:rPr>
         <w:t>submitted</w:t>
       </w:r>
@@ -19197,7 +19237,7 @@
           <w:sz w:val="24"/>
           <w:szCs w:val="24"/>
           <w:u w:val="none"/>
-          <w:lang w:val="en-US"/>
+          <w:lang w:val="en-GB"/>
         </w:rPr>
         <w:t xml:space="preserve"> proposals for a potential integration model aimed at meeting students’ expectations and increasing internationalization in higher education institutions. Our proposals were based on best practices from other countries. The main proposals focused on the period </w:t>
       </w:r>
@@ -19217,7 +19257,7 @@
           <w:sz w:val="24"/>
           <w:szCs w:val="24"/>
           <w:u w:val="none"/>
-          <w:lang w:val="en-US"/>
+          <w:lang w:val="en-GB"/>
         </w:rPr>
         <w:t>required</w:t>
       </w:r>
@@ -19237,7 +19277,7 @@
           <w:sz w:val="24"/>
           <w:szCs w:val="24"/>
           <w:u w:val="none"/>
-          <w:lang w:val="en-US"/>
+          <w:lang w:val="en-GB"/>
         </w:rPr>
         <w:t xml:space="preserve"> for post-study work; in this case, it was suggested to reduce it to 2 years, encouraging a greater focus on soft incentives for students to remain in Lithuania. We also highlighted the need for higher education institutions to provide international students with the opportunity to learn the Lithuanian language at no additional cost and to ensure more consistent dissemination of information about internships and employment opportunities not only in priority sectors, but also to expand communication to other sectors requiring skilled labor. Additionally, as part of the action plan implementation, we </w:t>
       </w:r>
@@ -19257,7 +19297,7 @@
           <w:sz w:val="24"/>
           <w:szCs w:val="24"/>
           <w:u w:val="none"/>
-          <w:lang w:val="en-US"/>
+          <w:lang w:val="en-GB"/>
         </w:rPr>
         <w:t>submitted</w:t>
       </w:r>
@@ -19277,7 +19317,7 @@
           <w:sz w:val="24"/>
           <w:szCs w:val="24"/>
           <w:u w:val="none"/>
-          <w:lang w:val="en-US"/>
+          <w:lang w:val="en-GB"/>
         </w:rPr>
         <w:t xml:space="preserve"> proposals for measures—one of the main ones being the creation of a mandatory civic orientation program. This measure would </w:t>
       </w:r>
@@ -19297,7 +19337,7 @@
           <w:sz w:val="24"/>
           <w:szCs w:val="24"/>
           <w:u w:val="none"/>
-          <w:lang w:val="en-US"/>
+          <w:lang w:val="en-GB"/>
         </w:rPr>
         <w:t>facilitate</w:t>
       </w:r>
@@ -19317,7 +19357,7 @@
           <w:sz w:val="24"/>
           <w:szCs w:val="24"/>
           <w:u w:val="none"/>
-          <w:lang w:val="en-US"/>
+          <w:lang w:val="en-GB"/>
         </w:rPr>
         <w:t xml:space="preserve"> the establishment of a standardized approach to social integration.</w:t>
       </w:r>
@@ -19390,26 +19430,26 @@
           <w:sz w:val="24"/>
           <w:szCs w:val="24"/>
           <w:u w:val="none"/>
-          <w:lang w:val="en-US"/>
-        </w:rPr>
-      </w:pPr>
-      <w:r>
-        <w:rPr>
-          <w:rFonts w:ascii="Aptos" w:hAnsi="Aptos" w:eastAsia="Aptos" w:cs="Aptos" w:asciiTheme="minorAscii" w:hAnsiTheme="minorAscii" w:eastAsiaTheme="minorAscii" w:cstheme="minorAscii"/>
-          <w:b w:val="0"/>
-          <w:bCs w:val="0"/>
-          <w:i w:val="0"/>
-          <w:iCs w:val="0"/>
-          <w:caps w:val="0"/>
-          <w:smallCaps w:val="0"/>
-          <w:strike w:val="0"/>
-          <w:dstrike w:val="0"/>
-          <w:noProof w:val="0"/>
-          <w:color w:val="212121"/>
-          <w:sz w:val="24"/>
-          <w:szCs w:val="24"/>
-          <w:u w:val="none"/>
-          <w:lang w:val="en-US"/>
+          <w:lang w:val="en-GB"/>
+        </w:rPr>
+      </w:pPr>
+      <w:r>
+        <w:rPr>
+          <w:rFonts w:ascii="Aptos" w:hAnsi="Aptos" w:eastAsia="Aptos" w:cs="Aptos" w:asciiTheme="minorAscii" w:hAnsiTheme="minorAscii" w:eastAsiaTheme="minorAscii" w:cstheme="minorAscii"/>
+          <w:b w:val="0"/>
+          <w:bCs w:val="0"/>
+          <w:i w:val="0"/>
+          <w:iCs w:val="0"/>
+          <w:caps w:val="0"/>
+          <w:smallCaps w:val="0"/>
+          <w:strike w:val="0"/>
+          <w:dstrike w:val="0"/>
+          <w:noProof w:val="0"/>
+          <w:color w:val="212121"/>
+          <w:sz w:val="24"/>
+          <w:szCs w:val="24"/>
+          <w:u w:val="none"/>
+          <w:lang w:val="en-GB"/>
         </w:rPr>
         <w:t xml:space="preserve">VU SR representatives participate in the Ministry of Education, Science and Sport’s coordination and expert working groups, aiming to develop guidelines for the improvement, assessment, and recognition of lecturers’ pedagogical competencies that meet international higher education quality standards and ensure the continuous professional development of lecturers. Student representatives participate in weekly working group meetings, contribute to drafting the guidelines, and take part in public consultations and workshops where various interested parties share their views on the need for the system, the structure of the system for teaching competencies, and discuss other relevant issues regarding the development and implementation of the guidelines within the Lithuanian higher education system.  </w:t>
       </w:r>
@@ -19436,26 +19476,26 @@
           <w:sz w:val="24"/>
           <w:szCs w:val="24"/>
           <w:u w:val="none"/>
-          <w:lang w:val="en-US"/>
-        </w:rPr>
-      </w:pPr>
-      <w:r>
-        <w:rPr>
-          <w:rFonts w:ascii="Aptos" w:hAnsi="Aptos" w:eastAsia="Aptos" w:cs="Aptos" w:asciiTheme="minorAscii" w:hAnsiTheme="minorAscii" w:eastAsiaTheme="minorAscii" w:cstheme="minorAscii"/>
-          <w:b w:val="0"/>
-          <w:bCs w:val="0"/>
-          <w:i w:val="0"/>
-          <w:iCs w:val="0"/>
-          <w:caps w:val="0"/>
-          <w:smallCaps w:val="0"/>
-          <w:strike w:val="0"/>
-          <w:dstrike w:val="0"/>
-          <w:noProof w:val="0"/>
-          <w:color w:val="212121"/>
-          <w:sz w:val="24"/>
-          <w:szCs w:val="24"/>
-          <w:u w:val="none"/>
-          <w:lang w:val="en-US"/>
+          <w:lang w:val="en-GB"/>
+        </w:rPr>
+      </w:pPr>
+      <w:r>
+        <w:rPr>
+          <w:rFonts w:ascii="Aptos" w:hAnsi="Aptos" w:eastAsia="Aptos" w:cs="Aptos" w:asciiTheme="minorAscii" w:hAnsiTheme="minorAscii" w:eastAsiaTheme="minorAscii" w:cstheme="minorAscii"/>
+          <w:b w:val="0"/>
+          <w:bCs w:val="0"/>
+          <w:i w:val="0"/>
+          <w:iCs w:val="0"/>
+          <w:caps w:val="0"/>
+          <w:smallCaps w:val="0"/>
+          <w:strike w:val="0"/>
+          <w:dstrike w:val="0"/>
+          <w:noProof w:val="0"/>
+          <w:color w:val="212121"/>
+          <w:sz w:val="24"/>
+          <w:szCs w:val="24"/>
+          <w:u w:val="none"/>
+          <w:lang w:val="en-GB"/>
         </w:rPr>
         <w:t>We participated in a meeting with representatives of the Ministry of Education, Science and Sport of the Republic of Lithuania and the State Studies Foundation (hereinafter referred to as the SSF) regarding improvements to the student loan model. We expressed our expectations for changes to the loan model aimed at increasing the attractiveness of loans and enhancing students’ financial security: by linking student loan repayment to graduates’ income and by improving loan repayment terms. Upon receiving the official document for review, we submitted written proposals for improving the model.</w:t>
       </w:r>
@@ -19482,26 +19522,26 @@
           <w:sz w:val="24"/>
           <w:szCs w:val="24"/>
           <w:u w:val="none"/>
-          <w:lang w:val="en-US"/>
-        </w:rPr>
-      </w:pPr>
-      <w:r>
-        <w:rPr>
-          <w:rFonts w:ascii="Aptos" w:hAnsi="Aptos" w:eastAsia="Aptos" w:cs="Aptos" w:asciiTheme="minorAscii" w:hAnsiTheme="minorAscii" w:eastAsiaTheme="minorAscii" w:cstheme="minorAscii"/>
-          <w:b w:val="0"/>
-          <w:bCs w:val="0"/>
-          <w:i w:val="0"/>
-          <w:iCs w:val="0"/>
-          <w:caps w:val="0"/>
-          <w:smallCaps w:val="0"/>
-          <w:strike w:val="0"/>
-          <w:dstrike w:val="0"/>
-          <w:noProof w:val="0"/>
-          <w:color w:val="212121"/>
-          <w:sz w:val="24"/>
-          <w:szCs w:val="24"/>
-          <w:u w:val="none"/>
-          <w:lang w:val="en-US"/>
+          <w:lang w:val="en-GB"/>
+        </w:rPr>
+      </w:pPr>
+      <w:r>
+        <w:rPr>
+          <w:rFonts w:ascii="Aptos" w:hAnsi="Aptos" w:eastAsia="Aptos" w:cs="Aptos" w:asciiTheme="minorAscii" w:hAnsiTheme="minorAscii" w:eastAsiaTheme="minorAscii" w:cstheme="minorAscii"/>
+          <w:b w:val="0"/>
+          <w:bCs w:val="0"/>
+          <w:i w:val="0"/>
+          <w:iCs w:val="0"/>
+          <w:caps w:val="0"/>
+          <w:smallCaps w:val="0"/>
+          <w:strike w:val="0"/>
+          <w:dstrike w:val="0"/>
+          <w:noProof w:val="0"/>
+          <w:color w:val="212121"/>
+          <w:sz w:val="24"/>
+          <w:szCs w:val="24"/>
+          <w:u w:val="none"/>
+          <w:lang w:val="en-GB"/>
         </w:rPr>
         <w:t xml:space="preserve">We have </w:t>
       </w:r>
@@ -19521,7 +19561,7 @@
           <w:sz w:val="24"/>
           <w:szCs w:val="24"/>
           <w:u w:val="none"/>
-          <w:lang w:val="en-US"/>
+          <w:lang w:val="en-GB"/>
         </w:rPr>
         <w:t>submitted</w:t>
       </w:r>
@@ -19541,7 +19581,7 @@
           <w:sz w:val="24"/>
           <w:szCs w:val="24"/>
           <w:u w:val="none"/>
-          <w:lang w:val="en-US"/>
+          <w:lang w:val="en-GB"/>
         </w:rPr>
         <w:t xml:space="preserve"> proposals to the Ministry of Education, </w:t>
       </w:r>
@@ -19561,7 +19601,7 @@
           <w:sz w:val="24"/>
           <w:szCs w:val="24"/>
           <w:u w:val="none"/>
-          <w:lang w:val="en-US"/>
+          <w:lang w:val="en-GB"/>
         </w:rPr>
         <w:t>Science,</w:t>
       </w:r>
@@ -19581,7 +19621,7 @@
           <w:sz w:val="24"/>
           <w:szCs w:val="24"/>
           <w:u w:val="none"/>
-          <w:lang w:val="en-US"/>
+          <w:lang w:val="en-GB"/>
         </w:rPr>
         <w:t xml:space="preserve"> and Sport </w:t>
       </w:r>
@@ -19601,7 +19641,7 @@
           <w:sz w:val="24"/>
           <w:szCs w:val="24"/>
           <w:u w:val="none"/>
-          <w:lang w:val="en-US"/>
+          <w:lang w:val="en-GB"/>
         </w:rPr>
         <w:t>regarding</w:t>
       </w:r>
@@ -19621,7 +19661,7 @@
           <w:sz w:val="24"/>
           <w:szCs w:val="24"/>
           <w:u w:val="none"/>
-          <w:lang w:val="en-US"/>
+          <w:lang w:val="en-GB"/>
         </w:rPr>
         <w:t xml:space="preserve"> improvements to the funding of priority-themed student projects administered by the SSF. The proposals included amendments to the current procedure manual aimed at increasing the attractiveness of the funding measure for student self-governments, as well as </w:t>
       </w:r>
@@ -19641,7 +19681,7 @@
           <w:sz w:val="24"/>
           <w:szCs w:val="24"/>
           <w:u w:val="none"/>
-          <w:lang w:val="en-US"/>
+          <w:lang w:val="en-GB"/>
         </w:rPr>
         <w:t>possible future</w:t>
       </w:r>
@@ -19661,7 +19701,7 @@
           <w:sz w:val="24"/>
           <w:szCs w:val="24"/>
           <w:u w:val="none"/>
-          <w:lang w:val="en-US"/>
+          <w:lang w:val="en-GB"/>
         </w:rPr>
         <w:t xml:space="preserve"> adjustments to the measure. We also </w:t>
       </w:r>
@@ -19681,7 +19721,7 @@
           <w:sz w:val="24"/>
           <w:szCs w:val="24"/>
           <w:u w:val="none"/>
-          <w:lang w:val="en-US"/>
+          <w:lang w:val="en-GB"/>
         </w:rPr>
         <w:t>submitted</w:t>
       </w:r>
@@ -19701,27 +19741,27 @@
           <w:sz w:val="24"/>
           <w:szCs w:val="24"/>
           <w:u w:val="none"/>
-          <w:lang w:val="en-US"/>
-        </w:rPr>
-        <w:t xml:space="preserve"> </w:t>
-      </w:r>
-      <w:r>
-        <w:rPr>
-          <w:rFonts w:ascii="Aptos" w:hAnsi="Aptos" w:eastAsia="Aptos" w:cs="Aptos" w:asciiTheme="minorAscii" w:hAnsiTheme="minorAscii" w:eastAsiaTheme="minorAscii" w:cstheme="minorAscii"/>
-          <w:b w:val="0"/>
-          <w:bCs w:val="0"/>
-          <w:i w:val="0"/>
-          <w:iCs w:val="0"/>
-          <w:caps w:val="0"/>
-          <w:smallCaps w:val="0"/>
-          <w:strike w:val="0"/>
-          <w:dstrike w:val="0"/>
-          <w:noProof w:val="0"/>
-          <w:color w:val="212121"/>
-          <w:sz w:val="24"/>
-          <w:szCs w:val="24"/>
-          <w:u w:val="none"/>
-          <w:lang w:val="en-US"/>
+          <w:lang w:val="en-GB"/>
+        </w:rPr>
+        <w:t xml:space="preserve"> </w:t>
+      </w:r>
+      <w:r>
+        <w:rPr>
+          <w:rFonts w:ascii="Aptos" w:hAnsi="Aptos" w:eastAsia="Aptos" w:cs="Aptos" w:asciiTheme="minorAscii" w:hAnsiTheme="minorAscii" w:eastAsiaTheme="minorAscii" w:cstheme="minorAscii"/>
+          <w:b w:val="0"/>
+          <w:bCs w:val="0"/>
+          <w:i w:val="0"/>
+          <w:iCs w:val="0"/>
+          <w:caps w:val="0"/>
+          <w:smallCaps w:val="0"/>
+          <w:strike w:val="0"/>
+          <w:dstrike w:val="0"/>
+          <w:noProof w:val="0"/>
+          <w:color w:val="212121"/>
+          <w:sz w:val="24"/>
+          <w:szCs w:val="24"/>
+          <w:u w:val="none"/>
+          <w:lang w:val="en-GB"/>
         </w:rPr>
         <w:t>additional</w:t>
       </w:r>
@@ -19741,7 +19781,7 @@
           <w:sz w:val="24"/>
           <w:szCs w:val="24"/>
           <w:u w:val="none"/>
-          <w:lang w:val="en-US"/>
+          <w:lang w:val="en-GB"/>
         </w:rPr>
         <w:t xml:space="preserve"> topics proposed by the Vilnius University Students' Representation for next year’s priority themes.</w:t>
       </w:r>
@@ -19768,26 +19808,26 @@
           <w:sz w:val="24"/>
           <w:szCs w:val="24"/>
           <w:u w:val="none"/>
-          <w:lang w:val="en-US"/>
-        </w:rPr>
-      </w:pPr>
-      <w:r>
-        <w:rPr>
-          <w:rFonts w:ascii="Aptos" w:hAnsi="Aptos" w:eastAsia="Aptos" w:cs="Aptos" w:asciiTheme="minorAscii" w:hAnsiTheme="minorAscii" w:eastAsiaTheme="minorAscii" w:cstheme="minorAscii"/>
-          <w:b w:val="0"/>
-          <w:bCs w:val="0"/>
-          <w:i w:val="0"/>
-          <w:iCs w:val="0"/>
-          <w:caps w:val="0"/>
-          <w:smallCaps w:val="0"/>
-          <w:strike w:val="0"/>
-          <w:dstrike w:val="0"/>
-          <w:noProof w:val="0"/>
-          <w:color w:val="212121"/>
-          <w:sz w:val="24"/>
-          <w:szCs w:val="24"/>
-          <w:u w:val="none"/>
-          <w:lang w:val="en-US"/>
+          <w:lang w:val="en-GB"/>
+        </w:rPr>
+      </w:pPr>
+      <w:r>
+        <w:rPr>
+          <w:rFonts w:ascii="Aptos" w:hAnsi="Aptos" w:eastAsia="Aptos" w:cs="Aptos" w:asciiTheme="minorAscii" w:hAnsiTheme="minorAscii" w:eastAsiaTheme="minorAscii" w:cstheme="minorAscii"/>
+          <w:b w:val="0"/>
+          <w:bCs w:val="0"/>
+          <w:i w:val="0"/>
+          <w:iCs w:val="0"/>
+          <w:caps w:val="0"/>
+          <w:smallCaps w:val="0"/>
+          <w:strike w:val="0"/>
+          <w:dstrike w:val="0"/>
+          <w:noProof w:val="0"/>
+          <w:color w:val="212121"/>
+          <w:sz w:val="24"/>
+          <w:szCs w:val="24"/>
+          <w:u w:val="none"/>
+          <w:lang w:val="en-GB"/>
         </w:rPr>
         <w:t xml:space="preserve">We presented the Organization’s position to the Ministry of Education, Science, and Sport </w:t>
       </w:r>
@@ -19807,7 +19847,7 @@
           <w:sz w:val="24"/>
           <w:szCs w:val="24"/>
           <w:u w:val="none"/>
-          <w:lang w:val="en-US"/>
+          <w:lang w:val="en-GB"/>
         </w:rPr>
         <w:t>regarding</w:t>
       </w:r>
@@ -19827,7 +19867,7 @@
           <w:sz w:val="24"/>
           <w:szCs w:val="24"/>
           <w:u w:val="none"/>
-          <w:lang w:val="en-US"/>
+          <w:lang w:val="en-GB"/>
         </w:rPr>
         <w:t xml:space="preserve"> amendments to the Law on the Legal Status of Foreigners, which aim to restrict international students’ ability to work. </w:t>
       </w:r>
@@ -19854,26 +19894,26 @@
           <w:sz w:val="24"/>
           <w:szCs w:val="24"/>
           <w:u w:val="none"/>
-          <w:lang w:val="en-US"/>
-        </w:rPr>
-      </w:pPr>
-      <w:r>
-        <w:rPr>
-          <w:rFonts w:ascii="Aptos" w:hAnsi="Aptos" w:eastAsia="Aptos" w:cs="Aptos" w:asciiTheme="minorAscii" w:hAnsiTheme="minorAscii" w:eastAsiaTheme="minorAscii" w:cstheme="minorAscii"/>
-          <w:b w:val="0"/>
-          <w:bCs w:val="0"/>
-          <w:i w:val="0"/>
-          <w:iCs w:val="0"/>
-          <w:caps w:val="0"/>
-          <w:smallCaps w:val="0"/>
-          <w:strike w:val="0"/>
-          <w:dstrike w:val="0"/>
-          <w:noProof w:val="0"/>
-          <w:color w:val="212121"/>
-          <w:sz w:val="24"/>
-          <w:szCs w:val="24"/>
-          <w:u w:val="none"/>
-          <w:lang w:val="en-US"/>
+          <w:lang w:val="en-GB"/>
+        </w:rPr>
+      </w:pPr>
+      <w:r>
+        <w:rPr>
+          <w:rFonts w:ascii="Aptos" w:hAnsi="Aptos" w:eastAsia="Aptos" w:cs="Aptos" w:asciiTheme="minorAscii" w:hAnsiTheme="minorAscii" w:eastAsiaTheme="minorAscii" w:cstheme="minorAscii"/>
+          <w:b w:val="0"/>
+          <w:bCs w:val="0"/>
+          <w:i w:val="0"/>
+          <w:iCs w:val="0"/>
+          <w:caps w:val="0"/>
+          <w:smallCaps w:val="0"/>
+          <w:strike w:val="0"/>
+          <w:dstrike w:val="0"/>
+          <w:noProof w:val="0"/>
+          <w:color w:val="212121"/>
+          <w:sz w:val="24"/>
+          <w:szCs w:val="24"/>
+          <w:u w:val="none"/>
+          <w:lang w:val="en-GB"/>
         </w:rPr>
         <w:t xml:space="preserve">We held a meeting with representatives of the Ministry of Education, Science and Sport and the Lithuanian Student Union </w:t>
       </w:r>
@@ -19893,7 +19933,7 @@
           <w:sz w:val="24"/>
           <w:szCs w:val="24"/>
           <w:u w:val="none"/>
-          <w:lang w:val="en-US"/>
+          <w:lang w:val="en-GB"/>
         </w:rPr>
         <w:t>regarding</w:t>
       </w:r>
@@ -19913,7 +19953,7 @@
           <w:sz w:val="24"/>
           <w:szCs w:val="24"/>
           <w:u w:val="none"/>
-          <w:lang w:val="en-US"/>
+          <w:lang w:val="en-GB"/>
         </w:rPr>
         <w:t xml:space="preserve"> the priority indicators for the social dimension of higher education. During the meeting, we emphasized the urgent need for these indicators; we approved the description of the indicators presented by the ministry, noting that the indicators could be expanded in the future</w:t>
       </w:r>
@@ -19933,7 +19973,7 @@
           <w:sz w:val="24"/>
           <w:szCs w:val="24"/>
           <w:u w:val="none"/>
-          <w:lang w:val="en-US"/>
+          <w:lang w:val="en-GB"/>
         </w:rPr>
         <w:t xml:space="preserve">.  </w:t>
       </w:r>
@@ -19960,26 +20000,26 @@
           <w:sz w:val="24"/>
           <w:szCs w:val="24"/>
           <w:u w:val="none"/>
-          <w:lang w:val="en-US"/>
-        </w:rPr>
-      </w:pPr>
-      <w:r>
-        <w:rPr>
-          <w:rFonts w:ascii="Aptos" w:hAnsi="Aptos" w:eastAsia="Aptos" w:cs="Aptos" w:asciiTheme="minorAscii" w:hAnsiTheme="minorAscii" w:eastAsiaTheme="minorAscii" w:cstheme="minorAscii"/>
-          <w:b w:val="0"/>
-          <w:bCs w:val="0"/>
-          <w:i w:val="0"/>
-          <w:iCs w:val="0"/>
-          <w:caps w:val="0"/>
-          <w:smallCaps w:val="0"/>
-          <w:strike w:val="0"/>
-          <w:dstrike w:val="0"/>
-          <w:noProof w:val="0"/>
-          <w:color w:val="212121"/>
-          <w:sz w:val="24"/>
-          <w:szCs w:val="24"/>
-          <w:u w:val="none"/>
-          <w:lang w:val="en-US"/>
+          <w:lang w:val="en-GB"/>
+        </w:rPr>
+      </w:pPr>
+      <w:r>
+        <w:rPr>
+          <w:rFonts w:ascii="Aptos" w:hAnsi="Aptos" w:eastAsia="Aptos" w:cs="Aptos" w:asciiTheme="minorAscii" w:hAnsiTheme="minorAscii" w:eastAsiaTheme="minorAscii" w:cstheme="minorAscii"/>
+          <w:b w:val="0"/>
+          <w:bCs w:val="0"/>
+          <w:i w:val="0"/>
+          <w:iCs w:val="0"/>
+          <w:caps w:val="0"/>
+          <w:smallCaps w:val="0"/>
+          <w:strike w:val="0"/>
+          <w:dstrike w:val="0"/>
+          <w:noProof w:val="0"/>
+          <w:color w:val="212121"/>
+          <w:sz w:val="24"/>
+          <w:szCs w:val="24"/>
+          <w:u w:val="none"/>
+          <w:lang w:val="en-GB"/>
         </w:rPr>
         <w:t xml:space="preserve">We also </w:t>
       </w:r>
@@ -19999,7 +20039,7 @@
           <w:sz w:val="24"/>
           <w:szCs w:val="24"/>
           <w:u w:val="none"/>
-          <w:lang w:val="en-US"/>
+          <w:lang w:val="en-GB"/>
         </w:rPr>
         <w:t>participated</w:t>
       </w:r>
@@ -20019,7 +20059,7 @@
           <w:sz w:val="24"/>
           <w:szCs w:val="24"/>
           <w:u w:val="none"/>
-          <w:lang w:val="en-US"/>
+          <w:lang w:val="en-GB"/>
         </w:rPr>
         <w:t xml:space="preserve"> in other inter-institutional meetings </w:t>
       </w:r>
@@ -20039,7 +20079,7 @@
           <w:sz w:val="24"/>
           <w:szCs w:val="24"/>
           <w:u w:val="none"/>
-          <w:lang w:val="en-US"/>
+          <w:lang w:val="en-GB"/>
         </w:rPr>
         <w:t>regarding</w:t>
       </w:r>
@@ -20059,7 +20099,7 @@
           <w:sz w:val="24"/>
           <w:szCs w:val="24"/>
           <w:u w:val="none"/>
-          <w:lang w:val="en-US"/>
+          <w:lang w:val="en-GB"/>
         </w:rPr>
         <w:t xml:space="preserve"> amendments to the Law on Science and Studies, addressing the situation </w:t>
       </w:r>
@@ -20079,7 +20119,7 @@
           <w:sz w:val="24"/>
           <w:szCs w:val="24"/>
           <w:u w:val="none"/>
-          <w:lang w:val="en-US"/>
+          <w:lang w:val="en-GB"/>
         </w:rPr>
         <w:t>regarding</w:t>
       </w:r>
@@ -20099,7 +20139,7 @@
           <w:sz w:val="24"/>
           <w:szCs w:val="24"/>
           <w:u w:val="none"/>
-          <w:lang w:val="en-US"/>
+          <w:lang w:val="en-GB"/>
         </w:rPr>
         <w:t xml:space="preserve"> admission to higher education institutions, and the addition of an extra 10 points to the state matriculation exams.</w:t>
       </w:r>
@@ -20433,26 +20473,26 @@
           <w:sz w:val="24"/>
           <w:szCs w:val="24"/>
           <w:u w:val="none"/>
-          <w:lang w:val="en-US"/>
-        </w:rPr>
-      </w:pPr>
-      <w:r>
-        <w:rPr>
-          <w:rFonts w:ascii="Aptos" w:hAnsi="Aptos" w:eastAsia="Aptos" w:cs="Aptos" w:asciiTheme="minorAscii" w:hAnsiTheme="minorAscii" w:eastAsiaTheme="minorAscii" w:cstheme="minorAscii"/>
-          <w:b w:val="0"/>
-          <w:bCs w:val="0"/>
-          <w:i w:val="0"/>
-          <w:iCs w:val="0"/>
-          <w:caps w:val="0"/>
-          <w:smallCaps w:val="0"/>
-          <w:strike w:val="0"/>
-          <w:dstrike w:val="0"/>
-          <w:noProof w:val="0"/>
-          <w:color w:val="212121"/>
-          <w:sz w:val="24"/>
-          <w:szCs w:val="24"/>
-          <w:u w:val="none"/>
-          <w:lang w:val="en-US"/>
+          <w:lang w:val="en-GB"/>
+        </w:rPr>
+      </w:pPr>
+      <w:r>
+        <w:rPr>
+          <w:rFonts w:ascii="Aptos" w:hAnsi="Aptos" w:eastAsia="Aptos" w:cs="Aptos" w:asciiTheme="minorAscii" w:hAnsiTheme="minorAscii" w:eastAsiaTheme="minorAscii" w:cstheme="minorAscii"/>
+          <w:b w:val="0"/>
+          <w:bCs w:val="0"/>
+          <w:i w:val="0"/>
+          <w:iCs w:val="0"/>
+          <w:caps w:val="0"/>
+          <w:smallCaps w:val="0"/>
+          <w:strike w:val="0"/>
+          <w:dstrike w:val="0"/>
+          <w:noProof w:val="0"/>
+          <w:color w:val="212121"/>
+          <w:sz w:val="24"/>
+          <w:szCs w:val="24"/>
+          <w:u w:val="none"/>
+          <w:lang w:val="en-GB"/>
         </w:rPr>
         <w:t xml:space="preserve">We invited students to </w:t>
       </w:r>
@@ -20472,7 +20512,7 @@
           <w:sz w:val="24"/>
           <w:szCs w:val="24"/>
           <w:u w:val="none"/>
-          <w:lang w:val="en-US"/>
+          <w:lang w:val="en-GB"/>
         </w:rPr>
         <w:t>participate</w:t>
       </w:r>
@@ -20492,7 +20532,7 @@
           <w:sz w:val="24"/>
           <w:szCs w:val="24"/>
           <w:u w:val="none"/>
-          <w:lang w:val="en-US"/>
+          <w:lang w:val="en-GB"/>
         </w:rPr>
         <w:t xml:space="preserve"> in an online training session organized by the Office of the Ombudsman for Academic Ethics of the Republic of Lithuania for first-year students and other members of the community. During the session, participants were introduced to the fundamental principles of academic ethics, the specifics of using artificial intelligence, and more</w:t>
       </w:r>
@@ -20512,7 +20552,7 @@
           <w:sz w:val="24"/>
           <w:szCs w:val="24"/>
           <w:u w:val="none"/>
-          <w:lang w:val="en-US"/>
+          <w:lang w:val="en-GB"/>
         </w:rPr>
         <w:t xml:space="preserve">.  </w:t>
       </w:r>
@@ -20950,76 +20990,76 @@
         </w:numPr>
         <w:rPr>
           <w:noProof w:val="0"/>
-          <w:lang w:val="en-US"/>
-        </w:rPr>
-      </w:pPr>
-      <w:r>
-        <w:rPr>
-          <w:noProof w:val="0"/>
-          <w:lang w:val="en-US"/>
+          <w:lang w:val="en-GB"/>
+        </w:rPr>
+      </w:pPr>
+      <w:r>
+        <w:rPr>
+          <w:noProof w:val="0"/>
+          <w:lang w:val="en-GB"/>
         </w:rPr>
         <w:t xml:space="preserve">We </w:t>
       </w:r>
       <w:r>
         <w:rPr>
           <w:noProof w:val="0"/>
-          <w:lang w:val="en-US"/>
+          <w:lang w:val="en-GB"/>
         </w:rPr>
         <w:t>participated</w:t>
       </w:r>
       <w:r>
         <w:rPr>
           <w:noProof w:val="0"/>
-          <w:lang w:val="en-US"/>
+          <w:lang w:val="en-GB"/>
         </w:rPr>
         <w:t xml:space="preserve"> in a consultation organized by the Centre for Quality Assessment in Higher Education </w:t>
       </w:r>
       <w:r>
         <w:rPr>
           <w:noProof w:val="0"/>
-          <w:lang w:val="en-US"/>
+          <w:lang w:val="en-GB"/>
         </w:rPr>
         <w:t>regarding</w:t>
       </w:r>
       <w:r>
         <w:rPr>
           <w:noProof w:val="0"/>
-          <w:lang w:val="en-US"/>
+          <w:lang w:val="en-GB"/>
         </w:rPr>
         <w:t xml:space="preserve"> the newly developed quality assessment model, together with the LSU. During and after the event, we </w:t>
       </w:r>
       <w:r>
         <w:rPr>
           <w:noProof w:val="0"/>
-          <w:lang w:val="en-US"/>
+          <w:lang w:val="en-GB"/>
         </w:rPr>
         <w:t>submitted</w:t>
       </w:r>
       <w:r>
         <w:rPr>
           <w:noProof w:val="0"/>
-          <w:lang w:val="en-US"/>
+          <w:lang w:val="en-GB"/>
         </w:rPr>
         <w:t xml:space="preserve"> written proposals on how to improve the future higher education institution evaluation model and how students could </w:t>
       </w:r>
       <w:r>
         <w:rPr>
           <w:noProof w:val="0"/>
-          <w:lang w:val="en-US"/>
+          <w:lang w:val="en-GB"/>
         </w:rPr>
         <w:t>participate</w:t>
       </w:r>
       <w:r>
         <w:rPr>
           <w:noProof w:val="0"/>
-          <w:lang w:val="en-US"/>
+          <w:lang w:val="en-GB"/>
         </w:rPr>
         <w:t xml:space="preserve"> more actively in external evaluation processes</w:t>
       </w:r>
       <w:r>
         <w:rPr>
           <w:noProof w:val="0"/>
-          <w:lang w:val="en-US"/>
+          <w:lang w:val="en-GB"/>
         </w:rPr>
         <w:t xml:space="preserve">.  </w:t>
       </w:r>
@@ -21351,35 +21391,35 @@
       <w:r>
         <w:rPr>
           <w:noProof w:val="0"/>
-          <w:lang w:val="en-US"/>
+          <w:lang w:val="en-GB"/>
         </w:rPr>
         <w:t>We strengthened our ties with International House Vilnius by organizing a discussion in the “BŪTENT Discussion Festival” – “Cultural Exchange in University: Facilitated or Assumed?</w:t>
       </w:r>
       <w:r>
         <w:rPr>
           <w:noProof w:val="0"/>
-          <w:lang w:val="en-US"/>
+          <w:lang w:val="en-GB"/>
         </w:rPr>
         <w:t>”.</w:t>
       </w:r>
       <w:r>
         <w:rPr>
           <w:noProof w:val="0"/>
-          <w:lang w:val="en-US"/>
+          <w:lang w:val="en-GB"/>
         </w:rPr>
         <w:t xml:space="preserve"> The topic of the discussion invited the audience to examine the role of universities, as leading institutions, in promoting intercultural understanding in today’s Lithuania. During the discussion, current integration strategies for incoming international students were discussed, as well as how universities have adapted to support and promote intercultural dialogue in the auditoriums, and what processes are planned for the future</w:t>
       </w:r>
       <w:r>
         <w:rPr>
           <w:noProof w:val="0"/>
-          <w:lang w:val="en-US"/>
+          <w:lang w:val="en-GB"/>
         </w:rPr>
         <w:t xml:space="preserve">.  </w:t>
       </w:r>
       <w:r>
         <w:rPr>
           <w:noProof w:val="0"/>
-          <w:lang w:val="en-US"/>
+          <w:lang w:val="en-GB"/>
         </w:rPr>
         <w:t xml:space="preserve"> </w:t>
       </w:r>
@@ -25556,8 +25596,8 @@
 </file>
 
 <file path=customXml/item1.xml><?xml version="1.0" encoding="utf-8"?>
-<ct:contentTypeSchema xmlns:ct="http://schemas.microsoft.com/office/2006/metadata/contentType" xmlns:ma="http://schemas.microsoft.com/office/2006/metadata/properties/metaAttributes" ct:_="" ma:_="" ma:contentTypeName="Dokumentas" ma:contentTypeID="0x01010031419BB974FF0444AC761B595520E27F" ma:contentTypeVersion="46" ma:contentTypeDescription="Kurkite naują dokumentą." ma:contentTypeScope="" ma:versionID="6d12eca580733347d153c8d79d06489f">
-  <xsd:schema xmlns:xsd="http://www.w3.org/2001/XMLSchema" xmlns:xs="http://www.w3.org/2001/XMLSchema" xmlns:p="http://schemas.microsoft.com/office/2006/metadata/properties" xmlns:ns1="http://schemas.microsoft.com/sharepoint/v3" xmlns:ns2="b33ada24-f80b-4dbc-a5fd-44f9c36e426a" xmlns:ns3="074b1ed8-1c8d-4c98-8bb5-56e33e4a0d6d" targetNamespace="http://schemas.microsoft.com/office/2006/metadata/properties" ma:root="true" ma:fieldsID="b8c9d70f65cf02a8adfbed8cc100a2fe" ns1:_="" ns2:_="" ns3:_="">
+<ct:contentTypeSchema xmlns:ct="http://schemas.microsoft.com/office/2006/metadata/contentType" xmlns:ma="http://schemas.microsoft.com/office/2006/metadata/properties/metaAttributes" ct:_="" ma:_="" ma:contentTypeName="Document" ma:contentTypeID="0x01010031419BB974FF0444AC761B595520E27F" ma:contentTypeVersion="46" ma:contentTypeDescription="Create a new document." ma:contentTypeScope="" ma:versionID="07526bf6fd83edd7b31f922f86555fa2">
+  <xsd:schema xmlns:xsd="http://www.w3.org/2001/XMLSchema" xmlns:xs="http://www.w3.org/2001/XMLSchema" xmlns:p="http://schemas.microsoft.com/office/2006/metadata/properties" xmlns:ns1="http://schemas.microsoft.com/sharepoint/v3" xmlns:ns2="b33ada24-f80b-4dbc-a5fd-44f9c36e426a" xmlns:ns3="074b1ed8-1c8d-4c98-8bb5-56e33e4a0d6d" targetNamespace="http://schemas.microsoft.com/office/2006/metadata/properties" ma:root="true" ma:fieldsID="35791db9501c7a59747203dac6a051d4" ns1:_="" ns2:_="" ns3:_="">
     <xsd:import namespace="http://schemas.microsoft.com/sharepoint/v3"/>
     <xsd:import namespace="b33ada24-f80b-4dbc-a5fd-44f9c36e426a"/>
     <xsd:import namespace="074b1ed8-1c8d-4c98-8bb5-56e33e4a0d6d"/>
@@ -25604,7 +25644,7 @@
   <xsd:schema xmlns:xsd="http://www.w3.org/2001/XMLSchema" xmlns:xs="http://www.w3.org/2001/XMLSchema" xmlns:dms="http://schemas.microsoft.com/office/2006/documentManagement/types" xmlns:pc="http://schemas.microsoft.com/office/infopath/2007/PartnerControls" targetNamespace="http://schemas.microsoft.com/sharepoint/v3" elementFormDefault="qualified">
     <xsd:import namespace="http://schemas.microsoft.com/office/2006/documentManagement/types"/>
     <xsd:import namespace="http://schemas.microsoft.com/office/infopath/2007/PartnerControls"/>
-    <xsd:element name="Language" ma:index="4" nillable="true" ma:displayName="Kalba" ma:default="Lietuvių" ma:description="" ma:format="Dropdown" ma:internalName="Language">
+    <xsd:element name="Language" ma:index="4" nillable="true" ma:displayName="Language" ma:default="Lietuvių" ma:description="" ma:format="Dropdown" ma:internalName="Language">
       <xsd:simpleType>
         <xsd:union memberTypes="dms:Text">
           <xsd:simpleType>
@@ -25742,7 +25782,7 @@
         <xsd:restriction base="dms:Unknown"/>
       </xsd:simpleType>
     </xsd:element>
-    <xsd:element name="lcf76f155ced4ddcb4097134ff3c332f" ma:index="31" nillable="true" ma:taxonomy="true" ma:internalName="lcf76f155ced4ddcb4097134ff3c332f" ma:taxonomyFieldName="MediaServiceImageTags" ma:displayName="Vaizdų žymės" ma:readOnly="false" ma:fieldId="{5cf76f15-5ced-4ddc-b409-7134ff3c332f}" ma:taxonomyMulti="true" ma:sspId="e6a4ed46-09c1-4180-b5d8-b772bf273c50" ma:termSetId="09814cd3-568e-fe90-9814-8d621ff8fb84" ma:anchorId="fba54fb3-c3e1-fe81-a776-ca4b69148c4d" ma:open="true" ma:isKeyword="false">
+    <xsd:element name="lcf76f155ced4ddcb4097134ff3c332f" ma:index="31" nillable="true" ma:taxonomy="true" ma:internalName="lcf76f155ced4ddcb4097134ff3c332f" ma:taxonomyFieldName="MediaServiceImageTags" ma:displayName="Image Tags" ma:readOnly="false" ma:fieldId="{5cf76f15-5ced-4ddc-b409-7134ff3c332f}" ma:taxonomyMulti="true" ma:sspId="e6a4ed46-09c1-4180-b5d8-b772bf273c50" ma:termSetId="09814cd3-568e-fe90-9814-8d621ff8fb84" ma:anchorId="fba54fb3-c3e1-fe81-a776-ca4b69148c4d" ma:open="true" ma:isKeyword="false">
       <xsd:complexType>
         <xsd:sequence>
           <xsd:element ref="pc:Terms" minOccurs="0" maxOccurs="1"/>
@@ -25789,7 +25829,7 @@
         </xsd:complexContent>
       </xsd:complexType>
     </xsd:element>
-    <xsd:element name="SharedWithUsers" ma:index="27" nillable="true" ma:displayName="Bendrinama su" ma:hidden="true" ma:internalName="SharedWithUsers" ma:readOnly="true">
+    <xsd:element name="SharedWithUsers" ma:index="27" nillable="true" ma:displayName="Shared With" ma:hidden="true" ma:internalName="SharedWithUsers" ma:readOnly="true">
       <xsd:complexType>
         <xsd:complexContent>
           <xsd:extension base="dms:UserMulti">
@@ -25808,7 +25848,7 @@
         </xsd:complexContent>
       </xsd:complexType>
     </xsd:element>
-    <xsd:element name="SharedWithDetails" ma:index="28" nillable="true" ma:displayName="Bendrinta su išsamia informacija" ma:hidden="true" ma:internalName="SharedWithDetails" ma:readOnly="true">
+    <xsd:element name="SharedWithDetails" ma:index="28" nillable="true" ma:displayName="Shared With Details" ma:hidden="true" ma:internalName="SharedWithDetails" ma:readOnly="true">
       <xsd:simpleType>
         <xsd:restriction base="dms:Note"/>
       </xsd:simpleType>
@@ -25823,8 +25863,8 @@
         <xsd:element ref="dc:creator" minOccurs="0" maxOccurs="1"/>
         <xsd:element ref="dcterms:created" minOccurs="0" maxOccurs="1"/>
         <xsd:element ref="dc:identifier" minOccurs="0" maxOccurs="1"/>
-        <xsd:element name="contentType" minOccurs="0" maxOccurs="1" type="xsd:string" ma:displayName="Turinio tipas"/>
-        <xsd:element ref="dc:title" minOccurs="0" maxOccurs="1" ma:index="1" ma:displayName="Antraštė"/>
+        <xsd:element name="contentType" minOccurs="0" maxOccurs="1" type="xsd:string" ma:displayName="Content Type"/>
+        <xsd:element ref="dc:title" minOccurs="0" maxOccurs="1" ma:index="1" ma:displayName="Title"/>
         <xsd:element ref="dc:subject" minOccurs="0" maxOccurs="1"/>
         <xsd:element ref="dc:description" minOccurs="0" maxOccurs="1"/>
         <xsd:element name="keywords" minOccurs="0" maxOccurs="1" type="xsd:string"/>
@@ -25952,7 +25992,7 @@
 </file>
 
 <file path=customXml/itemProps1.xml><?xml version="1.0" encoding="utf-8"?>
-<ds:datastoreItem xmlns:ds="http://schemas.openxmlformats.org/officeDocument/2006/customXml" ds:itemID="{0B735887-03A7-4770-9A1B-CD66483A66C5}"/>
+<ds:datastoreItem xmlns:ds="http://schemas.openxmlformats.org/officeDocument/2006/customXml" ds:itemID="{380B823F-051E-4DDE-86BB-B672F9DF6C64}"/>
 </file>
 
 <file path=customXml/itemProps2.xml><?xml version="1.0" encoding="utf-8"?>

</xml_diff>